<commit_message>
Update Yifeng report Part 5
</commit_message>
<xml_diff>
--- a/Yifeng CHEN 999016959/Quantum_Scattering_Project_Report.docx
+++ b/Yifeng CHEN 999016959/Quantum_Scattering_Project_Report.docx
@@ -2443,7 +2443,7 @@
         <w:jc w:val="both"/>
       </w:pPr>
       <w:r>
-        <w:t>The first ten numerical energies agree with the exact values Eₙ=n−0.3, from −0.3 to 8.7. The maximum absolute difference is about 4.70×10⁻¹³. This confirms that the box-basis matrix calculation gives the expected spectrum.</w:t>
+        <w:t>The first ten numerical energies agree with the exact values Eₙ=n−0.3, from −0.3 to 8.7. This shows that the box-basis matrix calculation gives the expected spectrum.</w:t>
       </w:r>
     </w:p>
     <w:p>
@@ -2515,7 +2515,7 @@
         <w:jc w:val="both"/>
       </w:pPr>
       <w:r>
-        <w:t>The lowest energy is E₀≈−0.29795964, and this wave function is localized around the central well. The other ten states have small positive energies and extend over the finite box. The positive-energy states occur in very close odd- and even-parity pairs.</w:t>
+        <w:t>The lowest energy is E₀≈−0.29795964, and this wave function is localized around the central well. The other ten states have small positive energies and extend over the finite box. Therefore, the lowest state is a bound state, while the positive-energy states are discretized continuum states.</w:t>
       </w:r>
     </w:p>
     <w:p>
@@ -2527,7 +2527,7 @@
       <w:r>
         <w:drawing>
           <wp:inline xmlns:a="http://schemas.openxmlformats.org/drawingml/2006/main" xmlns:pic="http://schemas.openxmlformats.org/drawingml/2006/picture">
-            <wp:extent cx="5166360" cy="4025993"/>
+            <wp:extent cx="5166360" cy="5538338"/>
             <wp:docPr id="18" name="Picture 18"/>
             <wp:cNvGraphicFramePr>
               <a:graphicFrameLocks noChangeAspect="1"/>
@@ -2548,7 +2548,7 @@
                   <pic:spPr>
                     <a:xfrm>
                       <a:off x="0" y="0"/>
-                      <a:ext cx="5166360" cy="4025993"/>
+                      <a:ext cx="5166360" cy="5538338"/>
                     </a:xfrm>
                     <a:prstGeom prst="rect"/>
                   </pic:spPr>
@@ -2659,7 +2659,7 @@
         <w:keepNext/>
       </w:pPr>
       <w:r>
-        <w:t>5.4 Localized bound and resonant states</w:t>
+        <w:t>5.4 Bound state and box states near the resonances</w:t>
       </w:r>
     </w:p>
     <w:p>
@@ -2671,7 +2671,7 @@
       <w:r>
         <w:drawing>
           <wp:inline xmlns:a="http://schemas.openxmlformats.org/drawingml/2006/main" xmlns:pic="http://schemas.openxmlformats.org/drawingml/2006/picture">
-            <wp:extent cx="5440680" cy="3365844"/>
+            <wp:extent cx="4754880" cy="2941578"/>
             <wp:docPr id="20" name="Picture 20"/>
             <wp:cNvGraphicFramePr>
               <a:graphicFrameLocks noChangeAspect="1"/>
@@ -2692,7 +2692,7 @@
                   <pic:spPr>
                     <a:xfrm>
                       <a:off x="0" y="0"/>
-                      <a:ext cx="5440680" cy="3365844"/>
+                      <a:ext cx="4754880" cy="2941578"/>
                     </a:xfrm>
                     <a:prstGeom prst="rect"/>
                   </pic:spPr>
@@ -2710,11 +2710,7 @@
         <w:jc w:val="center"/>
       </w:pPr>
       <w:r>
-        <w:rPr>
-          <w:i/>
-          <w:sz w:val="16"/>
-        </w:rPr>
-        <w:t>Figure 20. Bound state and two localized box states near the Part 3 resonance energies.</w:t>
+        <w:t>Figure 20. Bound state and two positive-energy box states near the Part 3 resonance energies.</w:t>
       </w:r>
     </w:p>
     <w:p>
@@ -2722,7 +2718,7 @@
         <w:jc w:val="both"/>
       </w:pPr>
       <w:r>
-        <w:t>The selected box states are n=0, 67, and 100, with energies E≈−0.29795964, E≈0.62097222, and E≈1.33028105. The two positive-energy values are close to the Part 3 resonances E₁≈0.62097030 and E₂≈1.32882395. Their wave functions have pronounced amplitudes inside the central well, showing that the resonances can also be identified from localization in the box basis. The first resonance is more strongly localized than the second.</w:t>
+        <w:t>The selected box states are n=0, 67, and 100, with energies E≈−0.29795964, E≈0.62097222, and E≈1.33028105. The two positive-energy values are close to the Part 3 resonances E₁≈0.62097030 and E₂≈1.32882395. Thus, two positive-energy box states are found close to the resonance energies obtained in Part 3. The state near the first resonance is more concentrated around the central well, while the state near the second resonance extends more strongly outside the barriers.</w:t>
       </w:r>
     </w:p>
     <w:p>

</xml_diff>

<commit_message>
Improve Yifeng Part 1 Part 3 Part 4 calculations
</commit_message>
<xml_diff>
--- a/Yifeng CHEN 999016959/Quantum_Scattering_Project_Report.docx
+++ b/Yifeng CHEN 999016959/Quantum_Scattering_Project_Report.docx
@@ -137,6 +137,54 @@
           <w:rFonts w:ascii="Cambria Math" w:hAnsi="Cambria Math"/>
         </w:rPr>
         <w:t xml:space="preserve"> p₀(x−x₀)].</w:t>
+      </w:r>
+    </w:p>
+    <w:p>
+      <w:pPr>
+        <w:jc w:val="both"/>
+      </w:pPr>
+      <w:r>
+        <w:t>To propagate the packet, the initial state is first transformed to momentum space,</w:t>
+      </w:r>
+    </w:p>
+    <w:p>
+      <w:pPr>
+        <w:jc w:val="center"/>
+      </w:pPr>
+      <w:r>
+        <w:rPr>
+          <w:rFonts w:ascii="Cambria Math" w:hAnsi="Cambria Math"/>
+          <w:sz w:val="22"/>
+        </w:rPr>
+        <w:t>Φ(p) = 1/√(2π) ∫ dx ψ(0,x) exp(−ipx).</w:t>
+      </w:r>
+    </w:p>
+    <w:p>
+      <w:pPr>
+        <w:jc w:val="both"/>
+      </w:pPr>
+      <w:r>
+        <w:t>With m=ℏ=1, each free-particle momentum component gains the phase exp(−ip²t/2). Transforming the components back to position space gives</w:t>
+      </w:r>
+    </w:p>
+    <w:p>
+      <w:pPr>
+        <w:jc w:val="center"/>
+      </w:pPr>
+      <w:r>
+        <w:rPr>
+          <w:rFonts w:ascii="Cambria Math" w:hAnsi="Cambria Math"/>
+          <w:sz w:val="22"/>
+        </w:rPr>
+        <w:t>ψ(t,x) = 1/√(2π) ∫ dp Φ(p) exp(ipx) exp(−ip²t/2).</w:t>
+      </w:r>
+    </w:p>
+    <w:p>
+      <w:pPr>
+        <w:jc w:val="both"/>
+      </w:pPr>
+      <w:r>
+        <w:t>This is the expression used to calculate the time snapshots in Figure 3.</w:t>
       </w:r>
     </w:p>
     <w:p>
@@ -953,43 +1001,110 @@
     <w:p>
       <w:pPr>
         <w:spacing w:before="20" w:after="20"/>
-      </w:pPr>
-      <w:r>
-        <w:rPr>
-          <w:rFonts w:eastAsia="宋体" w:hint="eastAsia"/>
-          <w:lang w:eastAsia="zh-CN"/>
-        </w:rPr>
-        <w:t>For</w:t>
-      </w:r>
-      <w:r>
-        <w:t xml:space="preserve"> each energy E, the stationary Schrödinger equation is solved </w:t>
-      </w:r>
-      <w:r>
-        <w:rPr>
-          <w:rFonts w:eastAsia="宋体" w:hint="eastAsia"/>
-          <w:lang w:eastAsia="zh-CN"/>
-        </w:rPr>
-        <w:t xml:space="preserve">numerically to obtain the </w:t>
-      </w:r>
-      <w:r>
-        <w:rPr>
-          <w:rFonts w:eastAsia="宋体"/>
-          <w:lang w:eastAsia="zh-CN"/>
-        </w:rPr>
-        <w:t>transmission and reflection probabilities</w:t>
-      </w:r>
-      <w:r>
-        <w:t xml:space="preserve"> |T|² and |R|².</w:t>
-      </w:r>
-      <w:r>
-        <w:rPr>
-          <w:rFonts w:eastAsia="宋体" w:hint="eastAsia"/>
-          <w:lang w:eastAsia="zh-CN"/>
-        </w:rPr>
-        <w:t xml:space="preserve"> </w:t>
-      </w:r>
-      <w:r>
-        <w:t>The two resonance energies discussed below are identified from the transmission spectrum.</w:t>
+        <w:jc w:val="both"/>
+      </w:pPr>
+      <w:r>
+        <w:t>For a chosen energy E, the free-region momentum is k=√(2E). The calculation starts on the right with a modified state containing only the outgoing wave,</w:t>
+      </w:r>
+    </w:p>
+    <w:p>
+      <w:pPr>
+        <w:jc w:val="center"/>
+      </w:pPr>
+      <w:r>
+        <w:rPr>
+          <w:rFonts w:ascii="Cambria Math" w:hAnsi="Cambria Math"/>
+          <w:sz w:val="22"/>
+        </w:rPr>
+        <w:t>ψ̄E(x→+∞) = exp(ikx).</w:t>
+      </w:r>
+    </w:p>
+    <w:p>
+      <w:pPr>
+        <w:jc w:val="both"/>
+      </w:pPr>
+      <w:r>
+        <w:t>The finite-difference Schrödinger equation is then used to propagate this state from right to left. On a grid with spacing Δx,</w:t>
+      </w:r>
+    </w:p>
+    <w:p>
+      <w:pPr>
+        <w:jc w:val="center"/>
+      </w:pPr>
+      <w:r>
+        <w:rPr>
+          <w:rFonts w:ascii="Cambria Math" w:hAnsi="Cambria Math"/>
+          <w:sz w:val="22"/>
+        </w:rPr>
+        <w:t>ψ̄E(xₙ₋₁) = [2 + 2(Δx)²(V(xₙ)−E)] ψ̄E(xₙ) − ψ̄E(xₙ₊₁).</w:t>
+      </w:r>
+    </w:p>
+    <w:p>
+      <w:pPr>
+        <w:jc w:val="both"/>
+      </w:pPr>
+      <w:r>
+        <w:t>In the left free region, the numerical state is written as</w:t>
+      </w:r>
+    </w:p>
+    <w:p>
+      <w:pPr>
+        <w:jc w:val="center"/>
+      </w:pPr>
+      <w:r>
+        <w:rPr>
+          <w:rFonts w:ascii="Cambria Math" w:hAnsi="Cambria Math"/>
+          <w:sz w:val="22"/>
+        </w:rPr>
+        <w:t>ψ̄E(x→−∞) = A(E) exp(ikx) + B(E) exp(−ikx).</w:t>
+      </w:r>
+    </w:p>
+    <w:p>
+      <w:pPr>
+        <w:jc w:val="both"/>
+      </w:pPr>
+      <w:r>
+        <w:t>Dividing by A(E) makes the incoming amplitude equal to one,</w:t>
+      </w:r>
+    </w:p>
+    <w:p>
+      <w:pPr>
+        <w:jc w:val="center"/>
+      </w:pPr>
+      <w:r>
+        <w:rPr>
+          <w:rFonts w:ascii="Cambria Math" w:hAnsi="Cambria Math"/>
+          <w:sz w:val="22"/>
+        </w:rPr>
+        <w:t>ψE(x) = ψ̄E(x)/A(E),</w:t>
+      </w:r>
+    </w:p>
+    <w:p>
+      <w:pPr>
+        <w:jc w:val="both"/>
+      </w:pPr>
+      <w:r>
+        <w:t>so the transmission and reflection amplitudes are</w:t>
+      </w:r>
+    </w:p>
+    <w:p>
+      <w:pPr>
+        <w:jc w:val="center"/>
+      </w:pPr>
+      <w:r>
+        <w:rPr>
+          <w:rFonts w:ascii="Cambria Math" w:hAnsi="Cambria Math"/>
+          <w:sz w:val="22"/>
+        </w:rPr>
+        <w:t>T(E) = 1/A(E),     R(E) = B(E)/A(E).</w:t>
+      </w:r>
+    </w:p>
+    <w:p>
+      <w:pPr>
+        <w:jc w:val="both"/>
+      </w:pPr>
+      <w:r>
+        <w:t>Repeating this calculation over E gives the probabilities |T(E)|² and |R(E)|². The two resonance energies discussed below are found from the peaks of the transmission spectrum.</w:t>
       </w:r>
     </w:p>
     <w:p>
@@ -1639,6 +1754,34 @@
     <w:p>
       <w:pPr>
         <w:jc w:val="both"/>
+      </w:pPr>
+      <w:r>
+        <w:t>The Gaussian coefficient is calculated from the incident wavepacket,</w:t>
+      </w:r>
+    </w:p>
+    <w:p>
+      <w:pPr>
+        <w:jc w:val="center"/>
+      </w:pPr>
+      <w:r>
+        <w:rPr>
+          <w:rFonts w:ascii="Cambria Math" w:hAnsi="Cambria Math"/>
+          <w:sz w:val="22"/>
+        </w:rPr>
+        <w:t>Φ(p) = 1/√(2π) ∫ dx Ψ(0,x) exp(−ipx).</w:t>
+      </w:r>
+    </w:p>
+    <w:p>
+      <w:pPr>
+        <w:jc w:val="both"/>
+      </w:pPr>
+      <w:r>
+        <w:t>Here Φ(p) gives the weight of each momentum, ψp(x) is the left-incident stationary scattering state calculated in Part 3, and exp(−ip²t/2) gives the time evolution of each momentum component. Therefore, the chosen momentum range determines which part of the transmission spectrum contributes to the wavepacket.</w:t>
+      </w:r>
+    </w:p>
+    <w:p>
+      <w:pPr>
+        <w:jc w:val="both"/>
         <w:rPr>
           <w:rFonts w:eastAsia="宋体"/>
           <w:lang w:eastAsia="zh-CN"/>
@@ -1846,13 +1989,9 @@
       </w:r>
     </w:p>
     <w:p>
-      <w:r>
-        <w:br w:type="page"/>
-      </w:r>
-    </w:p>
-    <w:p>
       <w:pPr>
         <w:pStyle w:val="21"/>
+        <w:pageBreakBefore/>
       </w:pPr>
       <w:r>
         <w:lastRenderedPageBreak/>

</xml_diff>

<commit_message>
Restructure Yifeng Part 1 Part 3 Part 4 explanations
</commit_message>
<xml_diff>
--- a/Yifeng CHEN 999016959/Quantum_Scattering_Project_Report.docx
+++ b/Yifeng CHEN 999016959/Quantum_Scattering_Project_Report.docx
@@ -144,7 +144,11 @@
         <w:jc w:val="both"/>
       </w:pPr>
       <w:r>
-        <w:t>To propagate the packet, the initial state is first transformed to momentum space,</w:t>
+        <w:rPr>
+          <w:rFonts w:ascii="Times New Roman" w:hAnsi="Times New Roman"/>
+          <w:sz w:val="22"/>
+        </w:rPr>
+        <w:t>The propagation is done in momentum space. The initial packet is Fourier transformed as</w:t>
       </w:r>
     </w:p>
     <w:p>
@@ -164,7 +168,11 @@
         <w:jc w:val="both"/>
       </w:pPr>
       <w:r>
-        <w:t>With m=ℏ=1, each free-particle momentum component gains the phase exp(−ip²t/2). Transforming the components back to position space gives</w:t>
+        <w:rPr>
+          <w:rFonts w:ascii="Times New Roman" w:hAnsi="Times New Roman"/>
+          <w:sz w:val="22"/>
+        </w:rPr>
+        <w:t>Each momentum component then gains the free-particle phase exp(−ip²t/2), giving</w:t>
       </w:r>
     </w:p>
     <w:p>
@@ -184,7 +192,11 @@
         <w:jc w:val="both"/>
       </w:pPr>
       <w:r>
-        <w:t>This is the expression used to calculate the time snapshots in Figure 3.</w:t>
+        <w:rPr>
+          <w:rFonts w:ascii="Times New Roman" w:hAnsi="Times New Roman"/>
+          <w:sz w:val="22"/>
+        </w:rPr>
+        <w:t>Figure 3 uses this expression at t = 0, 4, and 8.</w:t>
       </w:r>
     </w:p>
     <w:p>
@@ -1004,7 +1016,11 @@
         <w:jc w:val="both"/>
       </w:pPr>
       <w:r>
-        <w:t>For a chosen energy E, the free-region momentum is k=√(2E). The calculation starts on the right with a modified state containing only the outgoing wave,</w:t>
+        <w:rPr>
+          <w:rFonts w:ascii="Times New Roman" w:hAnsi="Times New Roman"/>
+          <w:sz w:val="22"/>
+        </w:rPr>
+        <w:t>For each E, k=√(2E) is calculated. On the far right, the solution is started as a single outgoing wave,</w:t>
       </w:r>
     </w:p>
     <w:p>
@@ -1024,7 +1040,11 @@
         <w:jc w:val="both"/>
       </w:pPr>
       <w:r>
-        <w:t>The finite-difference Schrödinger equation is then used to propagate this state from right to left. On a grid with spacing Δx,</w:t>
+        <w:rPr>
+          <w:rFonts w:ascii="Times New Roman" w:hAnsi="Times New Roman"/>
+          <w:sz w:val="22"/>
+        </w:rPr>
+        <w:t>Using the right-side values from this wave, the recurrence relation</w:t>
       </w:r>
     </w:p>
     <w:p>
@@ -1044,7 +1064,11 @@
         <w:jc w:val="both"/>
       </w:pPr>
       <w:r>
-        <w:t>In the left free region, the numerical state is written as</w:t>
+        <w:rPr>
+          <w:rFonts w:ascii="Times New Roman" w:hAnsi="Times New Roman"/>
+          <w:sz w:val="22"/>
+        </w:rPr>
+        <w:t>is applied point by point toward the left. In the left free region, the result is matched to</w:t>
       </w:r>
     </w:p>
     <w:p>
@@ -1064,7 +1088,11 @@
         <w:jc w:val="both"/>
       </w:pPr>
       <w:r>
-        <w:t>Dividing by A(E) makes the incoming amplitude equal to one,</w:t>
+        <w:rPr>
+          <w:rFonts w:ascii="Times New Roman" w:hAnsi="Times New Roman"/>
+          <w:sz w:val="22"/>
+        </w:rPr>
+        <w:t>A(E) is the incoming-wave coefficient and B(E) the reflected-wave coefficient. Dividing by A(E) gives</w:t>
       </w:r>
     </w:p>
     <w:p>
@@ -1084,7 +1112,11 @@
         <w:jc w:val="both"/>
       </w:pPr>
       <w:r>
-        <w:t>so the transmission and reflection amplitudes are</w:t>
+        <w:rPr>
+          <w:rFonts w:ascii="Times New Roman" w:hAnsi="Times New Roman"/>
+          <w:sz w:val="22"/>
+        </w:rPr>
+        <w:t>and hence</w:t>
       </w:r>
     </w:p>
     <w:p>
@@ -1104,7 +1136,11 @@
         <w:jc w:val="both"/>
       </w:pPr>
       <w:r>
-        <w:t>Repeating this calculation over E gives the probabilities |T(E)|² and |R(E)|². The two resonance energies discussed below are found from the peaks of the transmission spectrum.</w:t>
+        <w:rPr>
+          <w:rFonts w:ascii="Times New Roman" w:hAnsi="Times New Roman"/>
+          <w:sz w:val="22"/>
+        </w:rPr>
+        <w:t>Scanning E gives the transmission probability |T(E)|². Resonances appear as sharp peaks in this curve.</w:t>
       </w:r>
     </w:p>
     <w:p>
@@ -1756,7 +1792,11 @@
         <w:jc w:val="both"/>
       </w:pPr>
       <w:r>
-        <w:t>The Gaussian coefficient is calculated from the incident wavepacket,</w:t>
+        <w:rPr>
+          <w:rFonts w:ascii="Times New Roman" w:hAnsi="Times New Roman"/>
+          <w:sz w:val="22"/>
+        </w:rPr>
+        <w:t>The incident packet sets the momentum weights through</w:t>
       </w:r>
     </w:p>
     <w:p>
@@ -1776,7 +1816,11 @@
         <w:jc w:val="both"/>
       </w:pPr>
       <w:r>
-        <w:t>Here Φ(p) gives the weight of each momentum, ψp(x) is the left-incident stationary scattering state calculated in Part 3, and exp(−ip²t/2) gives the time evolution of each momentum component. Therefore, the chosen momentum range determines which part of the transmission spectrum contributes to the wavepacket.</w:t>
+        <w:rPr>
+          <w:rFonts w:ascii="Times New Roman" w:hAnsi="Times New Roman"/>
+          <w:sz w:val="22"/>
+        </w:rPr>
+        <w:t>Each p therefore contributes one Part 3 scattering state with its own phase. A momentum range covering both high- and low-transmission energies produces both transmitted and reflected parts, while a range inside a high-transmission region mainly passes through.</w:t>
       </w:r>
     </w:p>
     <w:p>

</xml_diff>

<commit_message>
Expand Yifeng Part 5 Hamiltonian explanation
</commit_message>
<xml_diff>
--- a/Yifeng CHEN 999016959/Quantum_Scattering_Project_Report.docx
+++ b/Yifeng CHEN 999016959/Quantum_Scattering_Project_Report.docx
@@ -117,14 +117,68 @@
       <w:pPr>
         <w:spacing w:before="20"/>
         <w:jc w:val="center"/>
+        <w:rPr>
+          <w:rFonts w:eastAsia="宋体" w:hint="eastAsia"/>
+          <w:lang w:eastAsia="zh-CN"/>
+        </w:rPr>
       </w:pPr>
       <w:r>
         <w:rPr>
           <w:rFonts w:ascii="Cambria Math" w:hAnsi="Cambria Math"/>
         </w:rPr>
-        <w:t>ψ(0,x) = (2a/π)¹ᐟ⁴ exp[−a(x−x₀)²] exp[</w:t>
+        <w:t>ψ(</w:t>
+      </w:r>
+      <w:proofErr w:type="gramStart"/>
+      <w:r>
+        <w:rPr>
+          <w:rFonts w:ascii="Cambria Math" w:hAnsi="Cambria Math"/>
+        </w:rPr>
+        <w:t>0,x</w:t>
+      </w:r>
+      <w:proofErr w:type="gramEnd"/>
+      <w:r>
+        <w:rPr>
+          <w:rFonts w:ascii="Cambria Math" w:hAnsi="Cambria Math"/>
+        </w:rPr>
+        <w:t>) = (2a/</w:t>
+      </w:r>
+      <w:proofErr w:type="gramStart"/>
+      <w:r>
+        <w:rPr>
+          <w:rFonts w:ascii="Cambria Math" w:hAnsi="Cambria Math"/>
+        </w:rPr>
+        <w:t>π)¹</w:t>
+      </w:r>
+      <w:proofErr w:type="gramEnd"/>
+      <w:r>
+        <w:rPr>
+          <w:rFonts w:ascii="Cambria Math" w:hAnsi="Cambria Math"/>
+        </w:rPr>
+        <w:t>ᐟ⁴ exp[−a(x−x</w:t>
+      </w:r>
+      <w:proofErr w:type="gramStart"/>
+      <w:r>
+        <w:rPr>
+          <w:rFonts w:ascii="Cambria Math" w:hAnsi="Cambria Math"/>
+        </w:rPr>
+        <w:t>₀)²</w:t>
+      </w:r>
+      <w:proofErr w:type="gramEnd"/>
+      <w:r>
+        <w:rPr>
+          <w:rFonts w:ascii="Cambria Math" w:hAnsi="Cambria Math"/>
+        </w:rPr>
+        <w:t xml:space="preserve">] </w:t>
+      </w:r>
+      <w:proofErr w:type="gramStart"/>
+      <w:r>
+        <w:rPr>
+          <w:rFonts w:ascii="Cambria Math" w:hAnsi="Cambria Math"/>
+        </w:rPr>
+        <w:t>exp[</w:t>
       </w:r>
       <w:proofErr w:type="spellStart"/>
+      <w:proofErr w:type="gramEnd"/>
       <w:r>
         <w:rPr>
           <w:rFonts w:ascii="Cambria Math" w:hAnsi="Cambria Math"/>
@@ -136,7 +190,7 @@
         <w:rPr>
           <w:rFonts w:ascii="Cambria Math" w:hAnsi="Cambria Math"/>
         </w:rPr>
-        <w:t xml:space="preserve"> p₀(x−x₀)].</w:t>
+        <w:t xml:space="preserve"> p₀(x−x₀)]</w:t>
       </w:r>
     </w:p>
     <w:p>
@@ -154,13 +208,57 @@
     <w:p>
       <w:pPr>
         <w:jc w:val="center"/>
+        <w:rPr>
+          <w:rFonts w:eastAsia="宋体" w:hint="eastAsia"/>
+          <w:lang w:eastAsia="zh-CN"/>
+        </w:rPr>
       </w:pPr>
       <w:r>
         <w:rPr>
           <w:rFonts w:ascii="Cambria Math" w:hAnsi="Cambria Math"/>
           <w:sz w:val="22"/>
         </w:rPr>
-        <w:t>Φ(p) = 1/√(2π) ∫ dx ψ(0,x) exp(−ipx).</w:t>
+        <w:t>Φ(p) = 1/√(2π) ∫ψ(</w:t>
+      </w:r>
+      <w:proofErr w:type="gramStart"/>
+      <w:r>
+        <w:rPr>
+          <w:rFonts w:ascii="Cambria Math" w:hAnsi="Cambria Math"/>
+          <w:sz w:val="22"/>
+        </w:rPr>
+        <w:t>0,x</w:t>
+      </w:r>
+      <w:proofErr w:type="gramEnd"/>
+      <w:r>
+        <w:rPr>
+          <w:rFonts w:ascii="Cambria Math" w:hAnsi="Cambria Math"/>
+          <w:sz w:val="22"/>
+        </w:rPr>
+        <w:t>) exp(−</w:t>
+      </w:r>
+      <w:proofErr w:type="spellStart"/>
+      <w:r>
+        <w:rPr>
+          <w:rFonts w:ascii="Cambria Math" w:hAnsi="Cambria Math"/>
+          <w:sz w:val="22"/>
+        </w:rPr>
+        <w:t>ipx</w:t>
+      </w:r>
+      <w:proofErr w:type="spellEnd"/>
+      <w:r>
+        <w:rPr>
+          <w:rFonts w:ascii="Cambria Math" w:hAnsi="Cambria Math"/>
+          <w:sz w:val="22"/>
+        </w:rPr>
+        <w:t>)</w:t>
+      </w:r>
+      <w:r>
+        <w:rPr>
+          <w:rFonts w:ascii="Cambria Math" w:eastAsia="宋体" w:hAnsi="Cambria Math" w:hint="eastAsia"/>
+          <w:sz w:val="22"/>
+          <w:lang w:eastAsia="zh-CN"/>
+        </w:rPr>
+        <w:t xml:space="preserve"> dx</w:t>
       </w:r>
     </w:p>
     <w:p>
@@ -178,14 +276,68 @@
     <w:p>
       <w:pPr>
         <w:jc w:val="center"/>
+        <w:rPr>
+          <w:rFonts w:eastAsia="宋体" w:hint="eastAsia"/>
+          <w:lang w:eastAsia="zh-CN"/>
+        </w:rPr>
       </w:pPr>
       <w:r>
         <w:rPr>
           <w:rFonts w:ascii="Cambria Math" w:hAnsi="Cambria Math"/>
           <w:sz w:val="22"/>
         </w:rPr>
-        <w:t>ψ(t,x) = 1/√(2π) ∫ dp Φ(p) exp(ipx) exp(−ip²t/2).</w:t>
-      </w:r>
+        <w:t>ψ(</w:t>
+      </w:r>
+      <w:proofErr w:type="gramStart"/>
+      <w:r>
+        <w:rPr>
+          <w:rFonts w:ascii="Cambria Math" w:hAnsi="Cambria Math"/>
+          <w:sz w:val="22"/>
+        </w:rPr>
+        <w:t>t,x</w:t>
+      </w:r>
+      <w:proofErr w:type="gramEnd"/>
+      <w:r>
+        <w:rPr>
+          <w:rFonts w:ascii="Cambria Math" w:hAnsi="Cambria Math"/>
+          <w:sz w:val="22"/>
+        </w:rPr>
+        <w:t>) = 1/√(2π) ∫Φ(p) exp(</w:t>
+      </w:r>
+      <w:proofErr w:type="spellStart"/>
+      <w:r>
+        <w:rPr>
+          <w:rFonts w:ascii="Cambria Math" w:hAnsi="Cambria Math"/>
+          <w:sz w:val="22"/>
+        </w:rPr>
+        <w:t>ipx</w:t>
+      </w:r>
+      <w:proofErr w:type="spellEnd"/>
+      <w:r>
+        <w:rPr>
+          <w:rFonts w:ascii="Cambria Math" w:hAnsi="Cambria Math"/>
+          <w:sz w:val="22"/>
+        </w:rPr>
+        <w:t>) exp(−ip²t/2)</w:t>
+      </w:r>
+      <w:r>
+        <w:rPr>
+          <w:rFonts w:ascii="Cambria Math" w:eastAsia="宋体" w:hAnsi="Cambria Math" w:hint="eastAsia"/>
+          <w:sz w:val="22"/>
+          <w:lang w:eastAsia="zh-CN"/>
+        </w:rPr>
+        <w:t xml:space="preserve"> </w:t>
+      </w:r>
+      <w:proofErr w:type="spellStart"/>
+      <w:r>
+        <w:rPr>
+          <w:rFonts w:ascii="Cambria Math" w:eastAsia="宋体" w:hAnsi="Cambria Math" w:hint="eastAsia"/>
+          <w:sz w:val="22"/>
+          <w:lang w:eastAsia="zh-CN"/>
+        </w:rPr>
+        <w:t>dp</w:t>
+      </w:r>
+      <w:proofErr w:type="spellEnd"/>
     </w:p>
     <w:p>
       <w:pPr>
@@ -740,9 +892,17 @@
         <w:rPr>
           <w:rFonts w:ascii="Cambria Math" w:hAnsi="Cambria Math"/>
         </w:rPr>
-        <w:t>(p) = sin(</w:t>
+        <w:t xml:space="preserve">(p) = </w:t>
+      </w:r>
+      <w:proofErr w:type="gramStart"/>
+      <w:r>
+        <w:rPr>
+          <w:rFonts w:ascii="Cambria Math" w:hAnsi="Cambria Math"/>
+        </w:rPr>
+        <w:t>sin(</w:t>
       </w:r>
       <w:proofErr w:type="spellStart"/>
+      <w:proofErr w:type="gramEnd"/>
       <w:r>
         <w:rPr>
           <w:rFonts w:ascii="Cambria Math" w:hAnsi="Cambria Math"/>
@@ -945,7 +1105,15 @@
         <w:jc w:val="both"/>
       </w:pPr>
       <w:r>
-        <w:t>The target value is φ(0) = 0.0012193111. The absolute difference decreases from 2.66×10⁻⁶ at L = 10 to 2.26×10⁻⁷ at L = 100 and 3.70×10⁻⁸ at L = 1000. This confirms the expected delta-function behavior for the chosen smooth test function.</w:t>
+        <w:t xml:space="preserve">The target value is </w:t>
+      </w:r>
+      <w:proofErr w:type="gramStart"/>
+      <w:r>
+        <w:t>φ(</w:t>
+      </w:r>
+      <w:proofErr w:type="gramEnd"/>
+      <w:r>
+        <w:t>0) = 0.0012193111. The absolute difference decreases from 2.66×10⁻⁶ at L = 10 to 2.26×10⁻⁷ at L = 100 and 3.70×10⁻⁸ at L = 1000. This confirms the expected delta-function behavior for the chosen smooth test function.</w:t>
       </w:r>
     </w:p>
     <w:p>
@@ -1056,7 +1224,23 @@
           <w:rFonts w:ascii="Cambria Math" w:hAnsi="Cambria Math"/>
           <w:sz w:val="22"/>
         </w:rPr>
-        <w:t>ψ̄E(xₙ₋₁) = [2 + 2(Δx)²(V(xₙ)−E)] ψ̄E(xₙ) − ψ̄E(xₙ₊₁).</w:t>
+        <w:t>ψ̄E(xₙ₋₁) = [2 + 2(Δ</w:t>
+      </w:r>
+      <w:proofErr w:type="gramStart"/>
+      <w:r>
+        <w:rPr>
+          <w:rFonts w:ascii="Cambria Math" w:hAnsi="Cambria Math"/>
+          <w:sz w:val="22"/>
+        </w:rPr>
+        <w:t>x)²</w:t>
+      </w:r>
+      <w:proofErr w:type="gramEnd"/>
+      <w:r>
+        <w:rPr>
+          <w:rFonts w:ascii="Cambria Math" w:hAnsi="Cambria Math"/>
+          <w:sz w:val="22"/>
+        </w:rPr>
+        <w:t>(V(xₙ)−E)] ψ̄E(xₙ) − ψ̄E(xₙ₊₁).</w:t>
       </w:r>
     </w:p>
     <w:p>
@@ -1128,7 +1312,23 @@
           <w:rFonts w:ascii="Cambria Math" w:hAnsi="Cambria Math"/>
           <w:sz w:val="22"/>
         </w:rPr>
-        <w:t>T(E) = 1/A(E),     R(E) = B(E)/A(E).</w:t>
+        <w:t>T(E) = 1/A(E</w:t>
+      </w:r>
+      <w:proofErr w:type="gramStart"/>
+      <w:r>
+        <w:rPr>
+          <w:rFonts w:ascii="Cambria Math" w:hAnsi="Cambria Math"/>
+          <w:sz w:val="22"/>
+        </w:rPr>
+        <w:t xml:space="preserve">),   </w:t>
+      </w:r>
+      <w:proofErr w:type="gramEnd"/>
+      <w:r>
+        <w:rPr>
+          <w:rFonts w:ascii="Cambria Math" w:hAnsi="Cambria Math"/>
+          <w:sz w:val="22"/>
+        </w:rPr>
+        <w:t xml:space="preserve">  R(E) = B(E)/A(E).</w:t>
       </w:r>
     </w:p>
     <w:p>
@@ -1233,6 +1433,7 @@
           <w:rFonts w:ascii="Aptos Display" w:eastAsia="宋体" w:hAnsi="Aptos Display" w:hint="eastAsia"/>
           <w:lang w:eastAsia="zh-CN"/>
         </w:rPr>
+        <w:lastRenderedPageBreak/>
         <w:t>3</w:t>
       </w:r>
       <w:r>
@@ -1350,7 +1551,6 @@
         <w:rPr>
           <w:noProof/>
         </w:rPr>
-        <w:lastRenderedPageBreak/>
         <w:drawing>
           <wp:inline distT="0" distB="0" distL="0" distR="0" wp14:anchorId="4D917084" wp14:editId="5F964D72">
             <wp:extent cx="5074920" cy="3356226"/>
@@ -1571,11 +1771,14 @@
         <w:spacing w:before="20" w:after="40"/>
         <w:jc w:val="both"/>
         <w:rPr>
-          <w:rFonts w:eastAsia="宋体"/>
+          <w:rFonts w:ascii="Times New Roman" w:eastAsia="宋体" w:hAnsi="Times New Roman" w:cs="Times New Roman"/>
           <w:lang w:eastAsia="zh-CN"/>
         </w:rPr>
       </w:pPr>
       <w:r>
+        <w:rPr>
+          <w:rFonts w:ascii="Times New Roman" w:hAnsi="Times New Roman" w:cs="Times New Roman"/>
+        </w:rPr>
         <w:t>First resonance. For E=0.40 and E=0.75, the wave is mainly reflected because the transmission probability is close to zero. At E≈0.62097030, the transmission rises to nearly one, so the wave passes through the potential almost completely. The resonance is also accompanied by a pronounced oscillation inside the central well.</w:t>
       </w:r>
     </w:p>
@@ -1662,18 +1865,27 @@
     <w:p>
       <w:pPr>
         <w:jc w:val="both"/>
-      </w:pPr>
-      <w:r>
+        <w:rPr>
+          <w:rFonts w:ascii="Times New Roman" w:hAnsi="Times New Roman" w:cs="Times New Roman"/>
+        </w:rPr>
+      </w:pPr>
+      <w:r>
+        <w:rPr>
+          <w:rFonts w:ascii="Times New Roman" w:hAnsi="Times New Roman" w:cs="Times New Roman"/>
+        </w:rPr>
         <w:t>Second resonance. At E=1.00 and E=1.60, the transmission is lower and a significant part of the wave is reflected. At E≈1.32882395, |T|²≈1, so the wave is transmitted almost completely through the potential. A pronounced oscillation also appears inside the central well.</w:t>
       </w:r>
     </w:p>
     <w:p>
       <w:pPr>
         <w:pStyle w:val="1"/>
-      </w:pPr>
-      <w:r>
-        <w:rPr>
-          <w:rFonts w:ascii="Aptos Display" w:hAnsi="Aptos Display"/>
+        <w:rPr>
+          <w:rFonts w:ascii="Times New Roman" w:hAnsi="Times New Roman" w:cs="Times New Roman"/>
+        </w:rPr>
+      </w:pPr>
+      <w:r>
+        <w:rPr>
+          <w:rFonts w:ascii="Times New Roman" w:hAnsi="Times New Roman" w:cs="Times New Roman"/>
         </w:rPr>
         <w:t>Part 4 — Time-dependent scattering wave packets</w:t>
       </w:r>
@@ -1682,34 +1894,46 @@
       <w:pPr>
         <w:jc w:val="both"/>
         <w:rPr>
-          <w:rFonts w:eastAsia="宋体"/>
+          <w:rFonts w:ascii="Times New Roman" w:eastAsia="宋体" w:hAnsi="Times New Roman" w:cs="Times New Roman"/>
           <w:lang w:eastAsia="zh-CN"/>
         </w:rPr>
       </w:pPr>
       <w:r>
+        <w:rPr>
+          <w:rFonts w:ascii="Times New Roman" w:hAnsi="Times New Roman" w:cs="Times New Roman"/>
+        </w:rPr>
         <w:t xml:space="preserve">The time-dependent </w:t>
       </w:r>
       <w:proofErr w:type="spellStart"/>
       <w:r>
+        <w:rPr>
+          <w:rFonts w:ascii="Times New Roman" w:hAnsi="Times New Roman" w:cs="Times New Roman"/>
+        </w:rPr>
         <w:t>wavepacket</w:t>
       </w:r>
       <w:proofErr w:type="spellEnd"/>
       <w:r>
+        <w:rPr>
+          <w:rFonts w:ascii="Times New Roman" w:hAnsi="Times New Roman" w:cs="Times New Roman"/>
+        </w:rPr>
         <w:t xml:space="preserve"> is constructed by </w:t>
       </w:r>
       <w:r>
         <w:rPr>
-          <w:rFonts w:eastAsia="宋体" w:hint="eastAsia"/>
+          <w:rFonts w:ascii="Times New Roman" w:eastAsia="宋体" w:hAnsi="Times New Roman" w:cs="Times New Roman"/>
           <w:lang w:eastAsia="zh-CN"/>
         </w:rPr>
         <w:t>adding</w:t>
       </w:r>
       <w:r>
+        <w:rPr>
+          <w:rFonts w:ascii="Times New Roman" w:hAnsi="Times New Roman" w:cs="Times New Roman"/>
+        </w:rPr>
         <w:t xml:space="preserve"> the stationary scattering states from Part 3 with a Gaussian momentum distribution. Different momentum ranges are then chosen to demonstrate </w:t>
       </w:r>
       <w:r>
         <w:rPr>
-          <w:rFonts w:eastAsia="宋体" w:hint="eastAsia"/>
+          <w:rFonts w:ascii="Times New Roman" w:eastAsia="宋体" w:hAnsi="Times New Roman" w:cs="Times New Roman"/>
           <w:lang w:eastAsia="zh-CN"/>
         </w:rPr>
         <w:t>blocked, partially blocked, and pass cases.</w:t>
@@ -1719,120 +1943,216 @@
       <w:pPr>
         <w:jc w:val="center"/>
         <w:rPr>
-          <w:rFonts w:ascii="Cambria Math" w:eastAsia="宋体" w:hAnsi="Cambria Math"/>
+          <w:rFonts w:ascii="Times New Roman" w:eastAsia="宋体" w:hAnsi="Times New Roman" w:cs="Times New Roman"/>
           <w:sz w:val="21"/>
           <w:lang w:eastAsia="zh-CN"/>
         </w:rPr>
       </w:pPr>
       <w:r>
         <w:rPr>
-          <w:rFonts w:ascii="Cambria Math" w:hAnsi="Cambria Math"/>
+          <w:rFonts w:ascii="Times New Roman" w:hAnsi="Times New Roman" w:cs="Times New Roman"/>
         </w:rPr>
         <w:t>Ψ(</w:t>
       </w:r>
       <w:proofErr w:type="spellStart"/>
-      <w:r>
-        <w:rPr>
-          <w:rFonts w:ascii="Cambria Math" w:hAnsi="Cambria Math"/>
+      <w:proofErr w:type="gramStart"/>
+      <w:r>
+        <w:rPr>
+          <w:rFonts w:ascii="Times New Roman" w:hAnsi="Times New Roman" w:cs="Times New Roman"/>
         </w:rPr>
         <w:t>t,x</w:t>
       </w:r>
       <w:proofErr w:type="spellEnd"/>
-      <w:r>
-        <w:rPr>
-          <w:rFonts w:ascii="Cambria Math" w:hAnsi="Cambria Math"/>
-        </w:rPr>
-        <w:t xml:space="preserve">) = ∫ </w:t>
+      <w:proofErr w:type="gramEnd"/>
+      <w:r>
+        <w:rPr>
+          <w:rFonts w:ascii="Times New Roman" w:hAnsi="Times New Roman" w:cs="Times New Roman"/>
+        </w:rPr>
+        <w:t>) = ∫</w:t>
+      </w:r>
+      <w:r>
+        <w:rPr>
+          <w:rFonts w:ascii="Times New Roman" w:eastAsia="宋体" w:hAnsi="Times New Roman" w:cs="Times New Roman"/>
+          <w:lang w:eastAsia="zh-CN"/>
+        </w:rPr>
+        <w:t xml:space="preserve"> </w:t>
+      </w:r>
+      <w:r>
+        <w:rPr>
+          <w:rFonts w:ascii="Times New Roman" w:hAnsi="Times New Roman" w:cs="Times New Roman"/>
+        </w:rPr>
+        <w:t xml:space="preserve">Φ(p) </w:t>
       </w:r>
       <w:proofErr w:type="spellStart"/>
       <w:r>
         <w:rPr>
-          <w:rFonts w:ascii="Cambria Math" w:hAnsi="Cambria Math"/>
+          <w:rFonts w:ascii="Times New Roman" w:hAnsi="Times New Roman" w:cs="Times New Roman"/>
+        </w:rPr>
+        <w:t>ψp</w:t>
+      </w:r>
+      <w:proofErr w:type="spellEnd"/>
+      <w:r>
+        <w:rPr>
+          <w:rFonts w:ascii="Times New Roman" w:hAnsi="Times New Roman" w:cs="Times New Roman"/>
+        </w:rPr>
+        <w:t xml:space="preserve">(x) </w:t>
+      </w:r>
+      <w:proofErr w:type="gramStart"/>
+      <w:r>
+        <w:rPr>
+          <w:rFonts w:ascii="Times New Roman" w:hAnsi="Times New Roman" w:cs="Times New Roman"/>
+        </w:rPr>
+        <w:t>exp(</w:t>
+      </w:r>
+      <w:proofErr w:type="gramEnd"/>
+      <w:r>
+        <w:rPr>
+          <w:rFonts w:ascii="Times New Roman" w:hAnsi="Times New Roman" w:cs="Times New Roman"/>
+        </w:rPr>
+        <w:t>−</w:t>
+      </w:r>
+      <w:proofErr w:type="spellStart"/>
+      <w:r>
+        <w:rPr>
+          <w:rFonts w:ascii="Times New Roman" w:hAnsi="Times New Roman" w:cs="Times New Roman"/>
+        </w:rPr>
+        <w:t>i</w:t>
+      </w:r>
+      <w:proofErr w:type="spellEnd"/>
+      <w:r>
+        <w:rPr>
+          <w:rFonts w:ascii="Times New Roman" w:hAnsi="Times New Roman" w:cs="Times New Roman"/>
+        </w:rPr>
+        <w:t xml:space="preserve"> p²t/2)</w:t>
+      </w:r>
+      <w:r>
+        <w:rPr>
+          <w:rFonts w:ascii="Times New Roman" w:eastAsia="宋体" w:hAnsi="Times New Roman" w:cs="Times New Roman"/>
+          <w:lang w:eastAsia="zh-CN"/>
+        </w:rPr>
+        <w:t xml:space="preserve"> </w:t>
+      </w:r>
+      <w:proofErr w:type="spellStart"/>
+      <w:r>
+        <w:rPr>
+          <w:rFonts w:ascii="Times New Roman" w:eastAsia="宋体" w:hAnsi="Times New Roman" w:cs="Times New Roman"/>
+          <w:lang w:eastAsia="zh-CN"/>
         </w:rPr>
         <w:t>dp</w:t>
       </w:r>
       <w:proofErr w:type="spellEnd"/>
-      <w:r>
-        <w:rPr>
-          <w:rFonts w:ascii="Cambria Math" w:hAnsi="Cambria Math"/>
-        </w:rPr>
-        <w:t xml:space="preserve"> Φ(p) </w:t>
-      </w:r>
-      <w:proofErr w:type="spellStart"/>
-      <w:r>
-        <w:rPr>
-          <w:rFonts w:ascii="Cambria Math" w:hAnsi="Cambria Math"/>
-        </w:rPr>
-        <w:t>ψp</w:t>
-      </w:r>
-      <w:proofErr w:type="spellEnd"/>
-      <w:r>
-        <w:rPr>
-          <w:rFonts w:ascii="Cambria Math" w:hAnsi="Cambria Math"/>
-        </w:rPr>
-        <w:t>(x) exp(−</w:t>
-      </w:r>
-      <w:proofErr w:type="spellStart"/>
-      <w:r>
-        <w:rPr>
-          <w:rFonts w:ascii="Cambria Math" w:hAnsi="Cambria Math"/>
-        </w:rPr>
-        <w:t>i</w:t>
-      </w:r>
-      <w:proofErr w:type="spellEnd"/>
-      <w:r>
-        <w:rPr>
-          <w:rFonts w:ascii="Cambria Math" w:hAnsi="Cambria Math"/>
-        </w:rPr>
-        <w:t xml:space="preserve"> p²t/2).</w:t>
-      </w:r>
     </w:p>
     <w:p>
       <w:pPr>
         <w:jc w:val="both"/>
+        <w:rPr>
+          <w:rFonts w:ascii="Times New Roman" w:hAnsi="Times New Roman" w:cs="Times New Roman"/>
+        </w:rPr>
+      </w:pPr>
+      <w:r>
+        <w:rPr>
+          <w:rFonts w:ascii="Times New Roman" w:hAnsi="Times New Roman" w:cs="Times New Roman"/>
+          <w:sz w:val="22"/>
+        </w:rPr>
+        <w:t>The incident packet sets the momentum weights through</w:t>
+      </w:r>
+    </w:p>
+    <w:p>
+      <w:pPr>
+        <w:jc w:val="center"/>
+        <w:rPr>
+          <w:rFonts w:ascii="Times New Roman" w:eastAsia="宋体" w:hAnsi="Times New Roman" w:cs="Times New Roman"/>
+          <w:lang w:eastAsia="zh-CN"/>
+        </w:rPr>
+      </w:pPr>
+      <w:r>
+        <w:rPr>
+          <w:rFonts w:ascii="Times New Roman" w:hAnsi="Times New Roman" w:cs="Times New Roman"/>
+          <w:sz w:val="22"/>
+        </w:rPr>
+        <w:t>Φ(p) = 1/√(2π) ∫</w:t>
+      </w:r>
+      <w:r>
+        <w:rPr>
+          <w:rFonts w:ascii="Times New Roman" w:eastAsia="宋体" w:hAnsi="Times New Roman" w:cs="Times New Roman"/>
+          <w:sz w:val="22"/>
+          <w:lang w:eastAsia="zh-CN"/>
+        </w:rPr>
+        <w:t xml:space="preserve"> </w:t>
+      </w:r>
+      <w:r>
+        <w:rPr>
+          <w:rFonts w:ascii="Times New Roman" w:hAnsi="Times New Roman" w:cs="Times New Roman"/>
+          <w:sz w:val="22"/>
+        </w:rPr>
+        <w:t>Ψ(</w:t>
+      </w:r>
+      <w:proofErr w:type="gramStart"/>
+      <w:r>
+        <w:rPr>
+          <w:rFonts w:ascii="Times New Roman" w:hAnsi="Times New Roman" w:cs="Times New Roman"/>
+          <w:sz w:val="22"/>
+        </w:rPr>
+        <w:t>0,x</w:t>
+      </w:r>
+      <w:proofErr w:type="gramEnd"/>
+      <w:r>
+        <w:rPr>
+          <w:rFonts w:ascii="Times New Roman" w:hAnsi="Times New Roman" w:cs="Times New Roman"/>
+          <w:sz w:val="22"/>
+        </w:rPr>
+        <w:t>) exp(−</w:t>
+      </w:r>
+      <w:proofErr w:type="spellStart"/>
+      <w:r>
+        <w:rPr>
+          <w:rFonts w:ascii="Times New Roman" w:hAnsi="Times New Roman" w:cs="Times New Roman"/>
+          <w:sz w:val="22"/>
+        </w:rPr>
+        <w:t>ipx</w:t>
+      </w:r>
+      <w:proofErr w:type="spellEnd"/>
+      <w:r>
+        <w:rPr>
+          <w:rFonts w:ascii="Times New Roman" w:hAnsi="Times New Roman" w:cs="Times New Roman"/>
+          <w:sz w:val="22"/>
+        </w:rPr>
+        <w:t>)</w:t>
+      </w:r>
+      <w:r>
+        <w:rPr>
+          <w:rFonts w:ascii="Times New Roman" w:eastAsia="宋体" w:hAnsi="Times New Roman" w:cs="Times New Roman"/>
+          <w:sz w:val="22"/>
+          <w:lang w:eastAsia="zh-CN"/>
+        </w:rPr>
+        <w:t xml:space="preserve"> dx</w:t>
+      </w:r>
+    </w:p>
+    <w:p>
+      <w:pPr>
+        <w:jc w:val="both"/>
       </w:pPr>
       <w:r>
         <w:rPr>
           <w:rFonts w:ascii="Times New Roman" w:hAnsi="Times New Roman"/>
           <w:sz w:val="22"/>
         </w:rPr>
-        <w:t>The incident packet sets the momentum weights through</w:t>
+        <w:lastRenderedPageBreak/>
+        <w:t>Each p therefore contributes one Part 3 scattering state with its own phase. A momentum range covering both high- and low-transmission energies produces both transmitted and reflected parts, while a range inside a high-transmission region mainly passes through.</w:t>
       </w:r>
     </w:p>
     <w:p>
       <w:pPr>
-        <w:jc w:val="center"/>
-      </w:pPr>
-      <w:r>
-        <w:rPr>
-          <w:rFonts w:ascii="Cambria Math" w:hAnsi="Cambria Math"/>
-          <w:sz w:val="22"/>
-        </w:rPr>
-        <w:t>Φ(p) = 1/√(2π) ∫ dx Ψ(0,x) exp(−ipx).</w:t>
-      </w:r>
-    </w:p>
-    <w:p>
-      <w:pPr>
         <w:jc w:val="both"/>
-      </w:pPr>
-      <w:r>
-        <w:rPr>
-          <w:rFonts w:ascii="Times New Roman" w:hAnsi="Times New Roman"/>
-          <w:sz w:val="22"/>
-        </w:rPr>
-        <w:t>Each p therefore contributes one Part 3 scattering state with its own phase. A momentum range covering both high- and low-transmission energies produces both transmitted and reflected parts, while a range inside a high-transmission region mainly passes through.</w:t>
-      </w:r>
-    </w:p>
-    <w:p>
-      <w:pPr>
-        <w:jc w:val="both"/>
-        <w:rPr>
-          <w:rFonts w:eastAsia="宋体"/>
+        <w:rPr>
+          <w:rFonts w:ascii="Times New Roman" w:eastAsia="宋体" w:hAnsi="Times New Roman" w:cs="Times New Roman"/>
           <w:lang w:eastAsia="zh-CN"/>
         </w:rPr>
       </w:pPr>
       <w:r>
-        <w:lastRenderedPageBreak/>
+        <w:rPr>
+          <w:rFonts w:ascii="Times New Roman" w:hAnsi="Times New Roman" w:cs="Times New Roman"/>
+        </w:rPr>
         <w:t>In the figures, a0 is the momentum uncertainty. The figures also show √2 a0, which corresponds to the width parameter of the momentum-space Gaussian amplitude Φ(p).</w:t>
       </w:r>
     </w:p>
@@ -2341,7 +2661,6 @@
       </w:r>
     </w:p>
     <w:p>
-      <w:pPr/>
       <w:r>
         <w:br w:type="page"/>
       </w:r>
@@ -2349,9 +2668,9 @@
     <w:p>
       <w:pPr>
         <w:pStyle w:val="1"/>
-        <w:keepNext/>
-      </w:pPr>
-      <w:r>
+      </w:pPr>
+      <w:r>
+        <w:lastRenderedPageBreak/>
         <w:t>Part 5 — Box-basis matrix calculation</w:t>
       </w:r>
     </w:p>
@@ -2378,7 +2697,31 @@
         <w:t>j</w:t>
       </w:r>
       <w:r>
-        <w:t>(x) = √(2/L) sin[jπ(x + L/2)/L],    j = 1, 2, …, J.</w:t>
+        <w:t xml:space="preserve">(x) = √(2/L) </w:t>
+      </w:r>
+      <w:proofErr w:type="gramStart"/>
+      <w:r>
+        <w:t>sin[</w:t>
+      </w:r>
+      <w:proofErr w:type="gramEnd"/>
+      <w:r>
+        <w:t>j</w:t>
+      </w:r>
+      <w:proofErr w:type="gramStart"/>
+      <w:r>
+        <w:t>π(</w:t>
+      </w:r>
+      <w:proofErr w:type="gramEnd"/>
+      <w:r>
+        <w:t>x + L/2)/L</w:t>
+      </w:r>
+      <w:proofErr w:type="gramStart"/>
+      <w:r>
+        <w:t xml:space="preserve">],   </w:t>
+      </w:r>
+      <w:proofErr w:type="gramEnd"/>
+      <w:r>
+        <w:t xml:space="preserve"> j = 1, 2, …, J.</w:t>
       </w:r>
     </w:p>
     <w:p>
@@ -2552,7 +2895,6 @@
     <w:p>
       <w:pPr>
         <w:pStyle w:val="21"/>
-        <w:keepNext/>
       </w:pPr>
       <w:r>
         <w:t>5.1 Harmonic-oscillator validation</w:t>
@@ -2573,18 +2915,248 @@
         <w:jc w:val="center"/>
       </w:pPr>
       <w:r>
+        <w:rPr>
+          <w:noProof/>
+        </w:rPr>
         <w:drawing>
-          <wp:inline xmlns:a="http://schemas.openxmlformats.org/drawingml/2006/main" xmlns:pic="http://schemas.openxmlformats.org/drawingml/2006/picture">
+          <wp:inline distT="0" distB="0" distL="0" distR="0" wp14:anchorId="7F8BB8B3" wp14:editId="2E39B32C">
             <wp:extent cx="5212080" cy="3788391"/>
+            <wp:effectExtent l="0" t="0" r="0" b="0"/>
             <wp:docPr id="16" name="Picture 16"/>
             <wp:cNvGraphicFramePr>
-              <a:graphicFrameLocks noChangeAspect="1"/>
+              <a:graphicFrameLocks xmlns:a="http://schemas.openxmlformats.org/drawingml/2006/main" noChangeAspect="1"/>
             </wp:cNvGraphicFramePr>
-            <a:graphic>
+            <a:graphic xmlns:a="http://schemas.openxmlformats.org/drawingml/2006/main">
               <a:graphicData uri="http://schemas.openxmlformats.org/drawingml/2006/picture">
-                <pic:pic>
+                <pic:pic xmlns:pic="http://schemas.openxmlformats.org/drawingml/2006/picture">
                   <pic:nvPicPr>
                     <pic:cNvPr id="0" name="harmonic_oscillator_validation.png"/>
+                    <pic:cNvPicPr/>
+                  </pic:nvPicPr>
+                  <pic:blipFill>
+                    <a:blip r:embed="rId23"/>
+                    <a:stretch>
+                      <a:fillRect/>
+                    </a:stretch>
+                  </pic:blipFill>
+                  <pic:spPr>
+                    <a:xfrm>
+                      <a:off x="0" y="0"/>
+                      <a:ext cx="5212080" cy="3788391"/>
+                    </a:xfrm>
+                    <a:prstGeom prst="rect">
+                      <a:avLst/>
+                    </a:prstGeom>
+                  </pic:spPr>
+                </pic:pic>
+              </a:graphicData>
+            </a:graphic>
+          </wp:inline>
+        </w:drawing>
+      </w:r>
+    </w:p>
+    <w:p>
+      <w:pPr>
+        <w:keepNext/>
+        <w:spacing w:before="20" w:after="30"/>
+        <w:jc w:val="center"/>
+      </w:pPr>
+      <w:r>
+        <w:rPr>
+          <w:i/>
+          <w:sz w:val="16"/>
+        </w:rPr>
+        <w:t>Figure 16. First ten harmonic-oscillator eigenstates obtained with the sine-box basis.</w:t>
+      </w:r>
+    </w:p>
+    <w:p>
+      <w:pPr>
+        <w:jc w:val="both"/>
+      </w:pPr>
+      <w:r>
+        <w:t>The first ten numerical energies agree with the exact values Eₙ=n−0.3, from −0.3 to 8.7. This shows that the box-basis matrix calculation gives the expected spectrum.</w:t>
+      </w:r>
+    </w:p>
+    <w:p>
+      <w:pPr>
+        <w:pStyle w:val="21"/>
+      </w:pPr>
+      <w:r>
+        <w:lastRenderedPageBreak/>
+        <w:t>5.2 First 11 short-range eigenstates</w:t>
+      </w:r>
+    </w:p>
+    <w:p>
+      <w:pPr>
+        <w:keepNext/>
+        <w:spacing w:before="20" w:after="20"/>
+        <w:jc w:val="center"/>
+      </w:pPr>
+      <w:r>
+        <w:rPr>
+          <w:noProof/>
+        </w:rPr>
+        <w:drawing>
+          <wp:inline distT="0" distB="0" distL="0" distR="0" wp14:anchorId="769B7A78" wp14:editId="45B6457B">
+            <wp:extent cx="5440680" cy="3571044"/>
+            <wp:effectExtent l="0" t="0" r="0" b="0"/>
+            <wp:docPr id="17" name="Picture 17"/>
+            <wp:cNvGraphicFramePr>
+              <a:graphicFrameLocks xmlns:a="http://schemas.openxmlformats.org/drawingml/2006/main" noChangeAspect="1"/>
+            </wp:cNvGraphicFramePr>
+            <a:graphic xmlns:a="http://schemas.openxmlformats.org/drawingml/2006/main">
+              <a:graphicData uri="http://schemas.openxmlformats.org/drawingml/2006/picture">
+                <pic:pic xmlns:pic="http://schemas.openxmlformats.org/drawingml/2006/picture">
+                  <pic:nvPicPr>
+                    <pic:cNvPr id="0" name="short_range_first11_combined.png"/>
+                    <pic:cNvPicPr/>
+                  </pic:nvPicPr>
+                  <pic:blipFill>
+                    <a:blip r:embed="rId24"/>
+                    <a:stretch>
+                      <a:fillRect/>
+                    </a:stretch>
+                  </pic:blipFill>
+                  <pic:spPr>
+                    <a:xfrm>
+                      <a:off x="0" y="0"/>
+                      <a:ext cx="5440680" cy="3571044"/>
+                    </a:xfrm>
+                    <a:prstGeom prst="rect">
+                      <a:avLst/>
+                    </a:prstGeom>
+                  </pic:spPr>
+                </pic:pic>
+              </a:graphicData>
+            </a:graphic>
+          </wp:inline>
+        </w:drawing>
+      </w:r>
+    </w:p>
+    <w:p>
+      <w:pPr>
+        <w:keepNext/>
+        <w:spacing w:before="20" w:after="30"/>
+        <w:jc w:val="center"/>
+      </w:pPr>
+      <w:r>
+        <w:rPr>
+          <w:i/>
+          <w:sz w:val="16"/>
+        </w:rPr>
+        <w:t>Figure 17. First 11 eigenstates of the short-range potential shown together.</w:t>
+      </w:r>
+    </w:p>
+    <w:p>
+      <w:pPr>
+        <w:jc w:val="both"/>
+      </w:pPr>
+      <w:r>
+        <w:t>The lowest energy is E₀≈−0.29795964, and this wave function is localized around the central well. The other ten states have small positive energies and extend over the finite box. Therefore, the lowest state is a bound state, while the positive-energy states are discretized continuum states.</w:t>
+      </w:r>
+    </w:p>
+    <w:p>
+      <w:pPr>
+        <w:keepNext/>
+        <w:spacing w:before="20" w:after="20"/>
+        <w:jc w:val="center"/>
+      </w:pPr>
+      <w:r>
+        <w:rPr>
+          <w:noProof/>
+        </w:rPr>
+        <w:lastRenderedPageBreak/>
+        <w:drawing>
+          <wp:inline distT="0" distB="0" distL="0" distR="0" wp14:anchorId="7C944B22" wp14:editId="6013542E">
+            <wp:extent cx="5166360" cy="5538338"/>
+            <wp:effectExtent l="0" t="0" r="0" b="0"/>
+            <wp:docPr id="18" name="Picture 18"/>
+            <wp:cNvGraphicFramePr>
+              <a:graphicFrameLocks xmlns:a="http://schemas.openxmlformats.org/drawingml/2006/main" noChangeAspect="1"/>
+            </wp:cNvGraphicFramePr>
+            <a:graphic xmlns:a="http://schemas.openxmlformats.org/drawingml/2006/main">
+              <a:graphicData uri="http://schemas.openxmlformats.org/drawingml/2006/picture">
+                <pic:pic xmlns:pic="http://schemas.openxmlformats.org/drawingml/2006/picture">
+                  <pic:nvPicPr>
+                    <pic:cNvPr id="0" name="short_range_first11_separate.png"/>
+                    <pic:cNvPicPr/>
+                  </pic:nvPicPr>
+                  <pic:blipFill>
+                    <a:blip r:embed="rId25"/>
+                    <a:stretch>
+                      <a:fillRect/>
+                    </a:stretch>
+                  </pic:blipFill>
+                  <pic:spPr>
+                    <a:xfrm>
+                      <a:off x="0" y="0"/>
+                      <a:ext cx="5166360" cy="5538338"/>
+                    </a:xfrm>
+                    <a:prstGeom prst="rect">
+                      <a:avLst/>
+                    </a:prstGeom>
+                  </pic:spPr>
+                </pic:pic>
+              </a:graphicData>
+            </a:graphic>
+          </wp:inline>
+        </w:drawing>
+      </w:r>
+    </w:p>
+    <w:p>
+      <w:pPr>
+        <w:keepNext/>
+        <w:spacing w:before="20" w:after="30"/>
+        <w:jc w:val="center"/>
+      </w:pPr>
+      <w:r>
+        <w:rPr>
+          <w:i/>
+          <w:sz w:val="16"/>
+        </w:rPr>
+        <w:t>Figure 18. First 11 eigenstates of the short-range potential shown separately.</w:t>
+      </w:r>
+    </w:p>
+    <w:p>
+      <w:pPr>
+        <w:jc w:val="both"/>
+      </w:pPr>
+      <w:r>
+        <w:t>The separate panels show the shapes of the same 11 states more clearly. As the energy increases, the wave functions have more oscillations over the box, while the bound state remains localized near x=0.</w:t>
+      </w:r>
+    </w:p>
+    <w:p>
+      <w:pPr>
+        <w:pStyle w:val="21"/>
+      </w:pPr>
+      <w:r>
+        <w:lastRenderedPageBreak/>
+        <w:t>5.3 All box states</w:t>
+      </w:r>
+    </w:p>
+    <w:p>
+      <w:pPr>
+        <w:keepNext/>
+        <w:spacing w:before="20" w:after="20"/>
+        <w:jc w:val="center"/>
+      </w:pPr>
+      <w:r>
+        <w:rPr>
+          <w:noProof/>
+        </w:rPr>
+        <w:drawing>
+          <wp:inline distT="0" distB="0" distL="0" distR="0" wp14:anchorId="60915A3A" wp14:editId="433F4407">
+            <wp:extent cx="5257800" cy="3934918"/>
+            <wp:effectExtent l="0" t="0" r="0" b="0"/>
+            <wp:docPr id="19" name="Picture 19"/>
+            <wp:cNvGraphicFramePr>
+              <a:graphicFrameLocks xmlns:a="http://schemas.openxmlformats.org/drawingml/2006/main" noChangeAspect="1"/>
+            </wp:cNvGraphicFramePr>
+            <a:graphic xmlns:a="http://schemas.openxmlformats.org/drawingml/2006/main">
+              <a:graphicData uri="http://schemas.openxmlformats.org/drawingml/2006/picture">
+                <pic:pic xmlns:pic="http://schemas.openxmlformats.org/drawingml/2006/picture">
+                  <pic:nvPicPr>
+                    <pic:cNvPr id="0" name="short_range_all_states.png"/>
                     <pic:cNvPicPr/>
                   </pic:nvPicPr>
                   <pic:blipFill>
@@ -2596,9 +3168,11 @@
                   <pic:spPr>
                     <a:xfrm>
                       <a:off x="0" y="0"/>
-                      <a:ext cx="5212080" cy="3788391"/>
+                      <a:ext cx="5257800" cy="3934918"/>
                     </a:xfrm>
-                    <a:prstGeom prst="rect"/>
+                    <a:prstGeom prst="rect">
+                      <a:avLst/>
+                    </a:prstGeom>
                   </pic:spPr>
                 </pic:pic>
               </a:graphicData>
@@ -2618,7 +3192,7 @@
           <w:i/>
           <w:sz w:val="16"/>
         </w:rPr>
-        <w:t>Figure 16. First ten harmonic-oscillator eigenstates obtained with the sine-box basis.</w:t>
+        <w:t>Figure 19. All 201 box eigenstates of the short-range potential.</w:t>
       </w:r>
     </w:p>
     <w:p>
@@ -2626,16 +3200,15 @@
         <w:jc w:val="both"/>
       </w:pPr>
       <w:r>
-        <w:t>The first ten numerical energies agree with the exact values Eₙ=n−0.3, from −0.3 to 8.7. This shows that the box-basis matrix calculation gives the expected spectrum.</w:t>
+        <w:t>Only the lowest state has negative energy. The many positive-energy states form a dense set because the finite box changes the scattering continuum into discrete box states. The negative-energy state is separated from them and is the only bound state.</w:t>
       </w:r>
     </w:p>
     <w:p>
       <w:pPr>
         <w:pStyle w:val="21"/>
-        <w:keepNext/>
-      </w:pPr>
-      <w:r>
-        <w:t>5.2 First 11 short-range eigenstates</w:t>
+      </w:pPr>
+      <w:r>
+        <w:t>5.4 Bound state and box states near the resonances</w:t>
       </w:r>
     </w:p>
     <w:p>
@@ -2645,18 +3218,22 @@
         <w:jc w:val="center"/>
       </w:pPr>
       <w:r>
+        <w:rPr>
+          <w:noProof/>
+        </w:rPr>
         <w:drawing>
-          <wp:inline xmlns:a="http://schemas.openxmlformats.org/drawingml/2006/main" xmlns:pic="http://schemas.openxmlformats.org/drawingml/2006/picture">
-            <wp:extent cx="5440680" cy="3571044"/>
-            <wp:docPr id="17" name="Picture 17"/>
+          <wp:inline distT="0" distB="0" distL="0" distR="0" wp14:anchorId="6D219C07" wp14:editId="3D6BB06E">
+            <wp:extent cx="4754880" cy="2941578"/>
+            <wp:effectExtent l="0" t="0" r="0" b="0"/>
+            <wp:docPr id="20" name="Picture 20"/>
             <wp:cNvGraphicFramePr>
-              <a:graphicFrameLocks noChangeAspect="1"/>
+              <a:graphicFrameLocks xmlns:a="http://schemas.openxmlformats.org/drawingml/2006/main" noChangeAspect="1"/>
             </wp:cNvGraphicFramePr>
-            <a:graphic>
+            <a:graphic xmlns:a="http://schemas.openxmlformats.org/drawingml/2006/main">
               <a:graphicData uri="http://schemas.openxmlformats.org/drawingml/2006/picture">
-                <pic:pic>
+                <pic:pic xmlns:pic="http://schemas.openxmlformats.org/drawingml/2006/picture">
                   <pic:nvPicPr>
-                    <pic:cNvPr id="0" name="short_range_first11_combined.png"/>
+                    <pic:cNvPr id="0" name="three_localized_states.png"/>
                     <pic:cNvPicPr/>
                   </pic:nvPicPr>
                   <pic:blipFill>
@@ -2668,9 +3245,11 @@
                   <pic:spPr>
                     <a:xfrm>
                       <a:off x="0" y="0"/>
-                      <a:ext cx="5440680" cy="3571044"/>
+                      <a:ext cx="4754880" cy="2941578"/>
                     </a:xfrm>
-                    <a:prstGeom prst="rect"/>
+                    <a:prstGeom prst="rect">
+                      <a:avLst/>
+                    </a:prstGeom>
                   </pic:spPr>
                 </pic:pic>
               </a:graphicData>
@@ -2686,11 +3265,7 @@
         <w:jc w:val="center"/>
       </w:pPr>
       <w:r>
-        <w:rPr>
-          <w:i/>
-          <w:sz w:val="16"/>
-        </w:rPr>
-        <w:t>Figure 17. First 11 eigenstates of the short-range potential shown together.</w:t>
+        <w:t>Figure 20. Bound state and two positive-energy box states near the Part 3 resonance energies.</w:t>
       </w:r>
     </w:p>
     <w:p>
@@ -2698,214 +3273,48 @@
         <w:jc w:val="both"/>
       </w:pPr>
       <w:r>
-        <w:t>The lowest energy is E₀≈−0.29795964, and this wave function is localized around the central well. The other ten states have small positive energies and extend over the finite box. Therefore, the lowest state is a bound state, while the positive-energy states are discretized continuum states.</w:t>
+        <w:t xml:space="preserve">The selected box states are n=0, 67, and 100, with energies </w:t>
+      </w:r>
+      <w:r>
+        <w:t>E</w:t>
+      </w:r>
+      <w:r>
+        <w:rPr>
+          <w:rFonts w:eastAsia="宋体" w:hint="eastAsia"/>
+          <w:lang w:eastAsia="zh-CN"/>
+        </w:rPr>
+        <w:t xml:space="preserve">0 </w:t>
+      </w:r>
+      <w:r>
+        <w:t xml:space="preserve">≈−0.29795964, </w:t>
+      </w:r>
+      <w:r>
+        <w:t>E₁</w:t>
+      </w:r>
+      <w:r>
+        <w:t xml:space="preserve">≈0.62097222, and </w:t>
+      </w:r>
+      <w:r>
+        <w:t>E₂</w:t>
+      </w:r>
+      <w:r>
+        <w:t xml:space="preserve">≈1.33028105. The two positive-energy values are close to the Part 3 resonances E₁≈0.62097030 and E₂≈1.32882395. From the wave functions, the state at </w:t>
+      </w:r>
+      <w:r>
+        <w:t>E₁</w:t>
+      </w:r>
+      <w:r>
+        <w:t xml:space="preserve">≈0.62097222 is mainly concentrated near the center, while the </w:t>
+      </w:r>
+      <w:r>
+        <w:t>E₂</w:t>
+      </w:r>
+      <w:r>
+        <w:t>≈1.33028105 state spreads farther across the box.</w:t>
       </w:r>
     </w:p>
     <w:p>
       <w:pPr>
-        <w:keepNext/>
-        <w:spacing w:before="20" w:after="20"/>
-        <w:jc w:val="center"/>
-      </w:pPr>
-      <w:r>
-        <w:drawing>
-          <wp:inline xmlns:a="http://schemas.openxmlformats.org/drawingml/2006/main" xmlns:pic="http://schemas.openxmlformats.org/drawingml/2006/picture">
-            <wp:extent cx="5166360" cy="5538338"/>
-            <wp:docPr id="18" name="Picture 18"/>
-            <wp:cNvGraphicFramePr>
-              <a:graphicFrameLocks noChangeAspect="1"/>
-            </wp:cNvGraphicFramePr>
-            <a:graphic>
-              <a:graphicData uri="http://schemas.openxmlformats.org/drawingml/2006/picture">
-                <pic:pic>
-                  <pic:nvPicPr>
-                    <pic:cNvPr id="0" name="short_range_first11_separate.png"/>
-                    <pic:cNvPicPr/>
-                  </pic:nvPicPr>
-                  <pic:blipFill>
-                    <a:blip r:embed="rId28"/>
-                    <a:stretch>
-                      <a:fillRect/>
-                    </a:stretch>
-                  </pic:blipFill>
-                  <pic:spPr>
-                    <a:xfrm>
-                      <a:off x="0" y="0"/>
-                      <a:ext cx="5166360" cy="5538338"/>
-                    </a:xfrm>
-                    <a:prstGeom prst="rect"/>
-                  </pic:spPr>
-                </pic:pic>
-              </a:graphicData>
-            </a:graphic>
-          </wp:inline>
-        </w:drawing>
-      </w:r>
-    </w:p>
-    <w:p>
-      <w:pPr>
-        <w:keepNext/>
-        <w:spacing w:before="20" w:after="30"/>
-        <w:jc w:val="center"/>
-      </w:pPr>
-      <w:r>
-        <w:rPr>
-          <w:i/>
-          <w:sz w:val="16"/>
-        </w:rPr>
-        <w:t>Figure 18. First 11 eigenstates of the short-range potential shown separately.</w:t>
-      </w:r>
-    </w:p>
-    <w:p>
-      <w:pPr>
-        <w:jc w:val="both"/>
-      </w:pPr>
-      <w:r>
-        <w:t>The separate panels show the shapes of the same 11 states more clearly. As the energy increases, the wave functions have more oscillations over the box, while the bound state remains localized near x=0.</w:t>
-      </w:r>
-    </w:p>
-    <w:p>
-      <w:pPr>
-        <w:pStyle w:val="21"/>
-        <w:keepNext/>
-      </w:pPr>
-      <w:r>
-        <w:t>5.3 All box states</w:t>
-      </w:r>
-    </w:p>
-    <w:p>
-      <w:pPr>
-        <w:keepNext/>
-        <w:spacing w:before="20" w:after="20"/>
-        <w:jc w:val="center"/>
-      </w:pPr>
-      <w:r>
-        <w:drawing>
-          <wp:inline xmlns:a="http://schemas.openxmlformats.org/drawingml/2006/main" xmlns:pic="http://schemas.openxmlformats.org/drawingml/2006/picture">
-            <wp:extent cx="5257800" cy="3934918"/>
-            <wp:docPr id="19" name="Picture 19"/>
-            <wp:cNvGraphicFramePr>
-              <a:graphicFrameLocks noChangeAspect="1"/>
-            </wp:cNvGraphicFramePr>
-            <a:graphic>
-              <a:graphicData uri="http://schemas.openxmlformats.org/drawingml/2006/picture">
-                <pic:pic>
-                  <pic:nvPicPr>
-                    <pic:cNvPr id="0" name="short_range_all_states.png"/>
-                    <pic:cNvPicPr/>
-                  </pic:nvPicPr>
-                  <pic:blipFill>
-                    <a:blip r:embed="rId29"/>
-                    <a:stretch>
-                      <a:fillRect/>
-                    </a:stretch>
-                  </pic:blipFill>
-                  <pic:spPr>
-                    <a:xfrm>
-                      <a:off x="0" y="0"/>
-                      <a:ext cx="5257800" cy="3934918"/>
-                    </a:xfrm>
-                    <a:prstGeom prst="rect"/>
-                  </pic:spPr>
-                </pic:pic>
-              </a:graphicData>
-            </a:graphic>
-          </wp:inline>
-        </w:drawing>
-      </w:r>
-    </w:p>
-    <w:p>
-      <w:pPr>
-        <w:keepNext/>
-        <w:spacing w:before="20" w:after="30"/>
-        <w:jc w:val="center"/>
-      </w:pPr>
-      <w:r>
-        <w:rPr>
-          <w:i/>
-          <w:sz w:val="16"/>
-        </w:rPr>
-        <w:t>Figure 19. All 201 box eigenstates of the short-range potential.</w:t>
-      </w:r>
-    </w:p>
-    <w:p>
-      <w:pPr>
-        <w:jc w:val="both"/>
-      </w:pPr>
-      <w:r>
-        <w:t>Only the lowest state has negative energy. The many positive-energy states form a dense set because the finite box changes the scattering continuum into discrete box states. The negative-energy state is separated from them and is the only bound state.</w:t>
-      </w:r>
-    </w:p>
-    <w:p>
-      <w:pPr>
-        <w:pStyle w:val="21"/>
-        <w:keepNext/>
-      </w:pPr>
-      <w:r>
-        <w:t>5.4 Bound state and box states near the resonances</w:t>
-      </w:r>
-    </w:p>
-    <w:p>
-      <w:pPr>
-        <w:keepNext/>
-        <w:spacing w:before="20" w:after="20"/>
-        <w:jc w:val="center"/>
-      </w:pPr>
-      <w:r>
-        <w:drawing>
-          <wp:inline xmlns:a="http://schemas.openxmlformats.org/drawingml/2006/main" xmlns:pic="http://schemas.openxmlformats.org/drawingml/2006/picture">
-            <wp:extent cx="4754880" cy="2941578"/>
-            <wp:docPr id="20" name="Picture 20"/>
-            <wp:cNvGraphicFramePr>
-              <a:graphicFrameLocks noChangeAspect="1"/>
-            </wp:cNvGraphicFramePr>
-            <a:graphic>
-              <a:graphicData uri="http://schemas.openxmlformats.org/drawingml/2006/picture">
-                <pic:pic>
-                  <pic:nvPicPr>
-                    <pic:cNvPr id="0" name="three_localized_states.png"/>
-                    <pic:cNvPicPr/>
-                  </pic:nvPicPr>
-                  <pic:blipFill>
-                    <a:blip r:embed="rId30"/>
-                    <a:stretch>
-                      <a:fillRect/>
-                    </a:stretch>
-                  </pic:blipFill>
-                  <pic:spPr>
-                    <a:xfrm>
-                      <a:off x="0" y="0"/>
-                      <a:ext cx="4754880" cy="2941578"/>
-                    </a:xfrm>
-                    <a:prstGeom prst="rect"/>
-                  </pic:spPr>
-                </pic:pic>
-              </a:graphicData>
-            </a:graphic>
-          </wp:inline>
-        </w:drawing>
-      </w:r>
-    </w:p>
-    <w:p>
-      <w:pPr>
-        <w:keepNext/>
-        <w:spacing w:before="20" w:after="30"/>
-        <w:jc w:val="center"/>
-      </w:pPr>
-      <w:r>
-        <w:t>Figure 20. Bound state and two positive-energy box states near the Part 3 resonance energies.</w:t>
-      </w:r>
-    </w:p>
-    <w:p>
-      <w:pPr>
-        <w:jc w:val="both"/>
-      </w:pPr>
-      <w:r>
-        <w:t>The selected box states are n=0, 67, and 100, with energies E≈−0.29795964, E≈0.62097222, and E≈1.33028105. The two positive-energy values are close to the Part 3 resonances E₁≈0.62097030 and E₂≈1.32882395. From the wave functions, the state at E≈0.62097222 is mainly concentrated near the center, while the E≈1.33028105 state spreads farther across the box.</w:t>
-      </w:r>
-    </w:p>
-    <w:p>
-      <w:pPr>
         <w:jc w:val="both"/>
       </w:pPr>
       <w:r>
@@ -2913,7 +3322,7 @@
       </w:r>
     </w:p>
     <w:sectPr>
-      <w:footerReference w:type="default" r:id="rId23"/>
+      <w:footerReference w:type="default" r:id="rId28"/>
       <w:pgSz w:w="11906" w:h="16838"/>
       <w:pgMar w:top="822" w:right="964" w:bottom="822" w:left="964" w:header="504" w:footer="504" w:gutter="0"/>
       <w:cols w:space="720"/>
@@ -3826,6 +4235,7 @@
   <w:style w:type="character" w:default="1" w:styleId="a2">
     <w:name w:val="Default Paragraph Font"/>
     <w:uiPriority w:val="1"/>
+    <w:semiHidden/>
     <w:unhideWhenUsed/>
   </w:style>
   <w:style w:type="table" w:default="1" w:styleId="a3">

</xml_diff>

<commit_message>
Complete Yifeng Part 5 Hamiltonian explanation
</commit_message>
<xml_diff>
--- a/Yifeng CHEN 999016959/Quantum_Scattering_Project_Report.docx
+++ b/Yifeng CHEN 999016959/Quantum_Scattering_Project_Report.docx
@@ -2794,7 +2794,7 @@
         <w:jc w:val="both"/>
       </w:pPr>
       <w:r>
-        <w:t>For m=ℏ=1, the Hamiltonian matrix is</w:t>
+        <w:t>For m=ℏ=1, the Hamiltonian is</w:t>
       </w:r>
     </w:p>
     <w:p>
@@ -2803,85 +2803,8 @@
         <w:jc w:val="center"/>
       </w:pPr>
       <w:r>
-        <w:t>H</w:t>
-      </w:r>
-      <w:r>
-        <w:rPr>
-          <w:vertAlign w:val="subscript"/>
-        </w:rPr>
-        <w:t>ij</w:t>
-      </w:r>
-      <w:r>
-        <w:t xml:space="preserve"> = j</w:t>
-      </w:r>
-      <w:r>
-        <w:rPr>
-          <w:vertAlign w:val="superscript"/>
-        </w:rPr>
-        <w:t>2</w:t>
-      </w:r>
-      <w:r>
-        <w:t>π</w:t>
-      </w:r>
-      <w:r>
-        <w:rPr>
-          <w:vertAlign w:val="superscript"/>
-        </w:rPr>
-        <w:t>2</w:t>
-      </w:r>
-      <w:r>
-        <w:t xml:space="preserve"> δ</w:t>
-      </w:r>
-      <w:r>
-        <w:rPr>
-          <w:vertAlign w:val="subscript"/>
-        </w:rPr>
-        <w:t>ij</w:t>
-      </w:r>
-      <w:r>
-        <w:t>/(2L</w:t>
-      </w:r>
-      <w:r>
-        <w:rPr>
-          <w:vertAlign w:val="superscript"/>
-        </w:rPr>
-        <w:t>2</w:t>
-      </w:r>
-      <w:r>
-        <w:t>) + ∫</w:t>
-      </w:r>
-      <w:r>
-        <w:rPr>
-          <w:vertAlign w:val="subscript"/>
-        </w:rPr>
-        <w:t>−L/2</w:t>
-      </w:r>
-      <w:r>
-        <w:rPr>
-          <w:vertAlign w:val="superscript"/>
-        </w:rPr>
-        <w:t>L/2</w:t>
-      </w:r>
-      <w:r>
-        <w:t xml:space="preserve"> φ</w:t>
-      </w:r>
-      <w:r>
-        <w:rPr>
-          <w:vertAlign w:val="subscript"/>
-        </w:rPr>
-        <w:t>i</w:t>
-      </w:r>
-      <w:r>
-        <w:t>(x)V(x)φ</w:t>
-      </w:r>
-      <w:r>
-        <w:rPr>
-          <w:vertAlign w:val="subscript"/>
-        </w:rPr>
-        <w:t>j</w:t>
-      </w:r>
-      <w:r>
-        <w:t>(x) dx.</w:t>
+        <w:rPr/>
+        <w:t>Ĥ = −1/2 d²/dx² + V(x).</w:t>
       </w:r>
     </w:p>
     <w:p>
@@ -2889,7 +2812,255 @@
         <w:jc w:val="both"/>
       </w:pPr>
       <w:r>
-        <w:t>After the Hamiltonian matrix is constructed, numerical diagonalization gives the energies and eigenfunctions. Here J is the number of basis functions, L is the length of the box, and N is the number of x points. The harmonic oscillator is first used to test the method, and then the same calculation is applied to the short-range potential from Part 3.</w:t>
+        <w:t>In the sine basis, its matrix elements are</w:t>
+      </w:r>
+    </w:p>
+    <w:p>
+      <w:pPr>
+        <w:spacing w:before="20" w:after="20"/>
+        <w:jc w:val="center"/>
+      </w:pPr>
+      <w:r>
+        <w:rPr/>
+        <w:t>H</w:t>
+      </w:r>
+      <w:r>
+        <w:rPr>
+          <w:vertAlign w:val="subscript"/>
+        </w:rPr>
+        <w:t>ij</w:t>
+      </w:r>
+      <w:r>
+        <w:rPr/>
+        <w:t xml:space="preserve"> = ⟨φ</w:t>
+      </w:r>
+      <w:r>
+        <w:rPr>
+          <w:vertAlign w:val="subscript"/>
+        </w:rPr>
+        <w:t>i</w:t>
+      </w:r>
+      <w:r>
+        <w:rPr/>
+        <w:t>|Ĥ|φ</w:t>
+      </w:r>
+      <w:r>
+        <w:rPr>
+          <w:vertAlign w:val="subscript"/>
+        </w:rPr>
+        <w:t>j</w:t>
+      </w:r>
+      <w:r>
+        <w:rPr/>
+        <w:t>⟩ = T</w:t>
+      </w:r>
+      <w:r>
+        <w:rPr>
+          <w:vertAlign w:val="subscript"/>
+        </w:rPr>
+        <w:t>ij</w:t>
+      </w:r>
+      <w:r>
+        <w:rPr/>
+        <w:t xml:space="preserve"> + V</w:t>
+      </w:r>
+      <w:r>
+        <w:rPr>
+          <w:vertAlign w:val="subscript"/>
+        </w:rPr>
+        <w:t>ij</w:t>
+      </w:r>
+      <w:r>
+        <w:rPr/>
+        <w:t>.</w:t>
+      </w:r>
+    </w:p>
+    <w:p>
+      <w:pPr>
+        <w:jc w:val="both"/>
+      </w:pPr>
+      <w:r>
+        <w:t>where</w:t>
+      </w:r>
+    </w:p>
+    <w:p>
+      <w:pPr>
+        <w:spacing w:before="20" w:after="20"/>
+        <w:jc w:val="center"/>
+      </w:pPr>
+      <w:r>
+        <w:rPr/>
+        <w:t>T</w:t>
+      </w:r>
+      <w:r>
+        <w:rPr>
+          <w:vertAlign w:val="subscript"/>
+        </w:rPr>
+        <w:t>ij</w:t>
+      </w:r>
+      <w:r>
+        <w:rPr/>
+        <w:t xml:space="preserve"> = j</w:t>
+      </w:r>
+      <w:r>
+        <w:rPr>
+          <w:vertAlign w:val="superscript"/>
+        </w:rPr>
+        <w:t>2</w:t>
+      </w:r>
+      <w:r>
+        <w:rPr/>
+        <w:t>π</w:t>
+      </w:r>
+      <w:r>
+        <w:rPr>
+          <w:vertAlign w:val="superscript"/>
+        </w:rPr>
+        <w:t>2</w:t>
+      </w:r>
+      <w:r>
+        <w:rPr/>
+        <w:t xml:space="preserve"> δ</w:t>
+      </w:r>
+      <w:r>
+        <w:rPr>
+          <w:vertAlign w:val="subscript"/>
+        </w:rPr>
+        <w:t>ij</w:t>
+      </w:r>
+      <w:r>
+        <w:rPr/>
+        <w:t>/(2L</w:t>
+      </w:r>
+      <w:r>
+        <w:rPr>
+          <w:vertAlign w:val="superscript"/>
+        </w:rPr>
+        <w:t>2</w:t>
+      </w:r>
+      <w:r>
+        <w:rPr/>
+        <w:t>),</w:t>
+      </w:r>
+    </w:p>
+    <w:p>
+      <w:pPr>
+        <w:spacing w:before="20" w:after="20"/>
+        <w:jc w:val="center"/>
+      </w:pPr>
+      <w:r>
+        <w:rPr/>
+        <w:t>V</w:t>
+      </w:r>
+      <w:r>
+        <w:rPr>
+          <w:vertAlign w:val="subscript"/>
+        </w:rPr>
+        <w:t>ij</w:t>
+      </w:r>
+      <w:r>
+        <w:rPr/>
+        <w:t xml:space="preserve"> = ∫</w:t>
+      </w:r>
+      <w:r>
+        <w:rPr>
+          <w:vertAlign w:val="subscript"/>
+        </w:rPr>
+        <w:t>−L/2</w:t>
+      </w:r>
+      <w:r>
+        <w:rPr>
+          <w:vertAlign w:val="superscript"/>
+        </w:rPr>
+        <w:t>L/2</w:t>
+      </w:r>
+      <w:r>
+        <w:rPr/>
+        <w:t xml:space="preserve"> φ</w:t>
+      </w:r>
+      <w:r>
+        <w:rPr>
+          <w:vertAlign w:val="subscript"/>
+        </w:rPr>
+        <w:t>i</w:t>
+      </w:r>
+      <w:r>
+        <w:rPr/>
+        <w:t>(x)V(x)φ</w:t>
+      </w:r>
+      <w:r>
+        <w:rPr>
+          <w:vertAlign w:val="subscript"/>
+        </w:rPr>
+        <w:t>j</w:t>
+      </w:r>
+      <w:r>
+        <w:rPr/>
+        <w:t>(x) dx.</w:t>
+      </w:r>
+    </w:p>
+    <w:p>
+      <w:pPr>
+        <w:jc w:val="both"/>
+      </w:pPr>
+      <w:r>
+        <w:t>The kinetic-energy term is diagonal because the sine basis functions are eigenfunctions of the particle-in-a-box kinetic operator. The potential term can couple different basis functions.</w:t>
+      </w:r>
+    </w:p>
+    <w:p>
+      <w:pPr>
+        <w:jc w:val="both"/>
+      </w:pPr>
+      <w:r>
+        <w:t>After the Hamiltonian matrix is constructed, the eigenvalue equation</w:t>
+      </w:r>
+    </w:p>
+    <w:p>
+      <w:pPr>
+        <w:spacing w:before="20" w:after="20"/>
+        <w:jc w:val="center"/>
+      </w:pPr>
+      <w:r>
+        <w:rPr/>
+        <w:t>Hc</w:t>
+      </w:r>
+      <w:r>
+        <w:rPr>
+          <w:vertAlign w:val="superscript"/>
+        </w:rPr>
+        <w:t>(n)</w:t>
+      </w:r>
+      <w:r>
+        <w:rPr/>
+        <w:t xml:space="preserve"> = E</w:t>
+      </w:r>
+      <w:r>
+        <w:rPr>
+          <w:vertAlign w:val="subscript"/>
+        </w:rPr>
+        <w:t>n</w:t>
+      </w:r>
+      <w:r>
+        <w:rPr/>
+        <w:t>c</w:t>
+      </w:r>
+      <w:r>
+        <w:rPr>
+          <w:vertAlign w:val="superscript"/>
+        </w:rPr>
+        <w:t>(n)</w:t>
+      </w:r>
+      <w:r>
+        <w:rPr/>
+        <w:t>.</w:t>
+      </w:r>
+    </w:p>
+    <w:p>
+      <w:pPr>
+        <w:jc w:val="both"/>
+      </w:pPr>
+      <w:r>
+        <w:t>is solved numerically to obtain the energies and eigenvectors. The eigenvector c⁽ⁿ⁾ gives the coefficients used to reconstruct ψₙ(x). Here J is the number of basis functions, L is the length of the box, and N is the number of x points. The harmonic oscillator is first used to test the method, and then the same calculation is applied to the short-range potential from Part 3.</w:t>
       </w:r>
     </w:p>
     <w:p>

</xml_diff>

<commit_message>
Refine Part 3 scattering wave-number explanation
</commit_message>
<xml_diff>
--- a/Yifeng CHEN 999016959/Quantum_Scattering_Project_Report.docx
+++ b/Yifeng CHEN 999016959/Quantum_Scattering_Project_Report.docx
@@ -1184,11 +1184,7 @@
         <w:jc w:val="both"/>
       </w:pPr>
       <w:r>
-        <w:rPr>
-          <w:rFonts w:ascii="Times New Roman" w:hAnsi="Times New Roman"/>
-          <w:sz w:val="22"/>
-        </w:rPr>
-        <w:t>For each E, k=√(2E) is calculated. On the far right, the solution is started as a single outgoing wave,</w:t>
+        <w:t>For each E, the calculation starts on the far right with a single outgoing wave, where k=√(2E) in the chosen units.</w:t>
       </w:r>
     </w:p>
     <w:p>

</xml_diff>